<commit_message>
Clarify evaluation evidence and reliability metrics
</commit_message>
<xml_diff>
--- a/deliverables/MAMA-Link_Multi-Agent_Submission_Documentation.docx
+++ b/deliverables/MAMA-Link_Multi-Agent_Submission_Documentation.docx
@@ -104,7 +104,7 @@
           <w:color w:val="4E5962"/>
           <w:sz w:val="21"/>
         </w:rPr>
-        <w:t>24 September 2026</w:t>
+        <w:t>25 September 2026</w:t>
       </w:r>
     </w:p>
     <w:p>
@@ -241,7 +241,7 @@
           <w:color w:val="000000"/>
           <w:sz w:val="21"/>
         </w:rPr>
-        <w:t>The main conclusion is that the architecture works as a controlled synthetic demonstration. On 24 September 2026, the patient-facing chat agent and the complete six-role Foundry workflow passed live tests against the existing gpt-4.1-mini deployment. Production use remains blocked by clinical validation, authenticated hosting, approved operational partners and independent evaluation.</w:t>
+        <w:t>The main conclusion is that the architecture works as a controlled synthetic demonstration. The patient-facing chat agent and complete six-role Foundry workflow passed live tests against gpt-4.1-mini. On 25 September 2026, 24 selected synthetic agent interactions completed the application's contract checks; this is not 24/24 classification accuracy or 24/24 direct Foundry evaluator passes. The local 24-case rule benchmark produced 19 exact matches and five expected-normal abstentions. Application Insights received privacy-minimised telemetry for all seven agents. Production use remains blocked by clinical validation, authenticated hosting, approved operational partners, held-out evaluation and operational reliability measurement.</w:t>
       </w:r>
     </w:p>
     <w:p>
@@ -716,6 +716,134 @@
                 <w:sz w:val="18"/>
               </w:rPr>
               <w:t>mama-link-chat v2 returned a consented educational answer through the localhost API</w:t>
+            </w:r>
+          </w:p>
+        </w:tc>
+      </w:tr>
+      <w:tr>
+        <w:trPr>
+          <w:cantSplit w:val="true"/>
+          <w:trHeight w:hRule="atLeast"/>
+        </w:trPr>
+        <w:tc>
+          <w:tcPr>
+            <w:tcW w:type="dxa" w:w="2951"/>
+            <w:shd w:fill="FFFFFF"/>
+            <w:vAlign w:val="center"/>
+            <w:tcMar>
+              <w:top w:w="105" w:type="dxa"/>
+              <w:start w:w="115" w:type="dxa"/>
+              <w:bottom w:w="105" w:type="dxa"/>
+              <w:end w:w="115" w:type="dxa"/>
+            </w:tcMar>
+          </w:tcPr>
+          <w:p>
+            <w:pPr>
+              <w:spacing w:before="0" w:after="0" w:line="252" w:lineRule="auto"/>
+              <w:jc w:val="left"/>
+            </w:pPr>
+            <w:r>
+              <w:rPr>
+                <w:rFonts w:ascii="Aptos" w:hAnsi="Aptos"/>
+                <w:b w:val="0"/>
+                <w:i w:val="0"/>
+                <w:color w:val="000000"/>
+                <w:sz w:val="18"/>
+              </w:rPr>
+              <w:t>Foundry selected-run completion</w:t>
+            </w:r>
+          </w:p>
+        </w:tc>
+        <w:tc>
+          <w:tcPr>
+            <w:tcW w:type="dxa" w:w="6696"/>
+            <w:shd w:fill="FFFFFF"/>
+            <w:vAlign w:val="center"/>
+            <w:tcMar>
+              <w:top w:w="105" w:type="dxa"/>
+              <w:start w:w="115" w:type="dxa"/>
+              <w:bottom w:w="105" w:type="dxa"/>
+              <w:end w:w="115" w:type="dxa"/>
+            </w:tcMar>
+          </w:tcPr>
+          <w:p>
+            <w:pPr>
+              <w:spacing w:before="0" w:after="0" w:line="252" w:lineRule="auto"/>
+              <w:jc w:val="left"/>
+            </w:pPr>
+            <w:r>
+              <w:rPr>
+                <w:rFonts w:ascii="Aptos" w:hAnsi="Aptos"/>
+                <w:b w:val="0"/>
+                <w:i w:val="0"/>
+                <w:color w:val="000000"/>
+                <w:sz w:val="18"/>
+              </w:rPr>
+              <w:t>24 of 24 selected synthetic interactions completed application contract checks; five client-tool roles were skipped by direct Foundry evaluators</w:t>
+            </w:r>
+          </w:p>
+        </w:tc>
+      </w:tr>
+      <w:tr>
+        <w:trPr>
+          <w:cantSplit w:val="true"/>
+          <w:trHeight w:hRule="atLeast"/>
+        </w:trPr>
+        <w:tc>
+          <w:tcPr>
+            <w:tcW w:type="dxa" w:w="2951"/>
+            <w:shd w:fill="EAF1F4"/>
+            <w:vAlign w:val="center"/>
+            <w:tcMar>
+              <w:top w:w="105" w:type="dxa"/>
+              <w:start w:w="115" w:type="dxa"/>
+              <w:bottom w:w="105" w:type="dxa"/>
+              <w:end w:w="115" w:type="dxa"/>
+            </w:tcMar>
+          </w:tcPr>
+          <w:p>
+            <w:pPr>
+              <w:spacing w:before="0" w:after="0" w:line="252" w:lineRule="auto"/>
+              <w:jc w:val="left"/>
+            </w:pPr>
+            <w:r>
+              <w:rPr>
+                <w:rFonts w:ascii="Aptos" w:hAnsi="Aptos"/>
+                <w:b w:val="0"/>
+                <w:i w:val="0"/>
+                <w:color w:val="000000"/>
+                <w:sz w:val="18"/>
+              </w:rPr>
+              <w:t>Foundry monitoring</w:t>
+            </w:r>
+          </w:p>
+        </w:tc>
+        <w:tc>
+          <w:tcPr>
+            <w:tcW w:type="dxa" w:w="6696"/>
+            <w:shd w:fill="EAF1F4"/>
+            <w:vAlign w:val="center"/>
+            <w:tcMar>
+              <w:top w:w="105" w:type="dxa"/>
+              <w:start w:w="115" w:type="dxa"/>
+              <w:bottom w:w="105" w:type="dxa"/>
+              <w:end w:w="115" w:type="dxa"/>
+            </w:tcMar>
+          </w:tcPr>
+          <w:p>
+            <w:pPr>
+              <w:spacing w:before="0" w:after="0" w:line="252" w:lineRule="auto"/>
+              <w:jc w:val="left"/>
+            </w:pPr>
+            <w:r>
+              <w:rPr>
+                <w:rFonts w:ascii="Aptos" w:hAnsi="Aptos"/>
+                <w:b w:val="0"/>
+                <w:i w:val="0"/>
+                <w:color w:val="000000"/>
+                <w:sz w:val="18"/>
+              </w:rPr>
+              <w:t>Application Insights connection active; named metadata received for all seven agents</w:t>
             </w:r>
           </w:p>
         </w:tc>
@@ -2088,7 +2216,7 @@
           <w:color w:val="000000"/>
           <w:sz w:val="20"/>
         </w:rPr>
-        <w:t>Aggregate Application Insights metrics limited to operation name, status and duration.</w:t>
+        <w:t>Application Insights aggregate metrics and metadata-only spans for all seven agents; prompts, outputs and health details are excluded.</w:t>
       </w:r>
     </w:p>
     <w:p>
@@ -3069,7 +3197,7 @@
                 <w:color w:val="000000"/>
                 <w:sz w:val="17"/>
               </w:rPr>
-              <w:t>Allow-listed aggregate operation count, status and duration</w:t>
+              <w:t>Allow-listed aggregate metrics plus metadata-only agent name, version, role and status spans</w:t>
             </w:r>
           </w:p>
         </w:tc>
@@ -3130,7 +3258,7 @@
           <w:color w:val="000000"/>
           <w:sz w:val="21"/>
         </w:rPr>
-        <w:t>The implemented design separates the workflow into six specialist roles. Ask Mama Link is a seventh prompt agent used only for patient-facing education. Agent versions below are the live versions verified on 24 September 2026.</w:t>
+        <w:t>The implemented design separates the workflow into six specialist roles. Ask Mama Link is a seventh prompt agent used only for patient-facing education. Agent versions below were live-verified on 24 September 2026 and evaluated in Foundry on 25 September 2026.</w:t>
       </w:r>
     </w:p>
     <w:tbl>
@@ -6830,7 +6958,7 @@
           <w:color w:val="000000"/>
           <w:sz w:val="21"/>
         </w:rPr>
-        <w:t>The current monitor records only allow-listed aggregate fields: operation, status and duration. Automatic FastAPI, request and Azure SDK capture is disabled so symptoms, prompts, notes, case IDs, session IDs, routes and tool payloads are not collected by default. Production observability should preserve that minimisation while adding role-level health signals.</w:t>
+        <w:t>Application Insights is connected to the Foundry project as mamalink-appinsights. The application records allow-listed aggregate operation metrics and metadata-only spans containing agent name, version, role and synthetic-data status. Automatic FastAPI, request and Azure SDK capture is disabled, so symptoms, prompts, outputs, notes, case IDs, session IDs, routes and tool payloads are not collected by the application's manual telemetry. Events, traces, dependencies and metrics were observed for all seven agents on 25 September 2026.</w:t>
       </w:r>
     </w:p>
     <w:tbl>
@@ -7720,7 +7848,7 @@
           <w:color w:val="000000"/>
           <w:sz w:val="21"/>
         </w:rPr>
-        <w:t>A production trace should use a generated correlation ID and nested spans for orchestration, each agent invocation, each tool execution and validation. Tags may include agent role, agent version, contract version, tool name, status and duration. The trace must exclude prompts, symptoms, identifiers and raw outputs unless a separately approved, access-controlled diagnostic process is established.</w:t>
+        <w:t>The current implementation creates a metadata-only span around each agent invocation and records agent name, version and role. A production trace should extend this with a generated correlation ID and nested spans for orchestration, tool execution and validation. The trace must continue to exclude prompts, symptoms, identifiers and raw outputs unless a separately approved, access-controlled diagnostic process is established. Trace-filtered service-side evaluation additionally requires an Azure administrator to grant the project managed identity Log Analytics Reader on Application Insights and its workspace; this permission does not block the current dashboards or completed evaluations.</w:t>
       </w:r>
     </w:p>
     <w:p>
@@ -10183,7 +10311,7 @@
                 <w:color w:val="000000"/>
                 <w:sz w:val="16"/>
               </w:rPr>
-              <w:t>Only aggregate operation, status and duration are emitted</w:t>
+              <w:t>Aggregate metrics and metadata-only agent spans; content capture disabled</w:t>
             </w:r>
           </w:p>
         </w:tc>
@@ -10645,7 +10773,7 @@
           <w:color w:val="000000"/>
           <w:sz w:val="21"/>
         </w:rPr>
-        <w:t>The current web application runs on localhost and uses a local SQLite database. The Foundry agents, model deployment, File Search vector store and monitoring workspace exist in Azure. This split is appropriate for a hackathon demonstration but not for public service.</w:t>
+        <w:t>The current web application runs on localhost and uses a local SQLite database. The seven Foundry agents, model deployment, File Search vector store, Application Insights connection, evaluation runs and monitoring workspace exist in Azure. This split is appropriate for a hackathon demonstration but not for public service.</w:t>
       </w:r>
     </w:p>
     <w:p>
@@ -11940,12 +12068,342 @@
           </w:p>
         </w:tc>
       </w:tr>
+      <w:tr>
+        <w:trPr>
+          <w:cantSplit w:val="true"/>
+          <w:trHeight w:hRule="atLeast"/>
+        </w:trPr>
+        <w:tc>
+          <w:tcPr>
+            <w:tcW w:type="dxa" w:w="2088"/>
+            <w:shd w:fill="FFFFFF"/>
+            <w:vAlign w:val="center"/>
+            <w:tcMar>
+              <w:top w:w="105" w:type="dxa"/>
+              <w:start w:w="115" w:type="dxa"/>
+              <w:bottom w:w="105" w:type="dxa"/>
+              <w:end w:w="115" w:type="dxa"/>
+            </w:tcMar>
+          </w:tcPr>
+          <w:p>
+            <w:pPr>
+              <w:spacing w:before="0" w:after="0" w:line="252" w:lineRule="auto"/>
+              <w:jc w:val="left"/>
+            </w:pPr>
+            <w:r>
+              <w:rPr>
+                <w:rFonts w:ascii="Aptos" w:hAnsi="Aptos"/>
+                <w:b w:val="0"/>
+                <w:i w:val="0"/>
+                <w:color w:val="000000"/>
+                <w:sz w:val="17"/>
+              </w:rPr>
+              <w:t>Foundry selected-run completion</w:t>
+            </w:r>
+          </w:p>
+        </w:tc>
+        <w:tc>
+          <w:tcPr>
+            <w:tcW w:type="dxa" w:w="2232"/>
+            <w:shd w:fill="FFFFFF"/>
+            <w:vAlign w:val="center"/>
+            <w:tcMar>
+              <w:top w:w="105" w:type="dxa"/>
+              <w:start w:w="115" w:type="dxa"/>
+              <w:bottom w:w="105" w:type="dxa"/>
+              <w:end w:w="115" w:type="dxa"/>
+            </w:tcMar>
+          </w:tcPr>
+          <w:p>
+            <w:pPr>
+              <w:spacing w:before="0" w:after="0" w:line="252" w:lineRule="auto"/>
+              <w:jc w:val="left"/>
+            </w:pPr>
+            <w:r>
+              <w:rPr>
+                <w:rFonts w:ascii="Aptos" w:hAnsi="Aptos"/>
+                <w:b w:val="0"/>
+                <w:i w:val="0"/>
+                <w:color w:val="000000"/>
+                <w:sz w:val="17"/>
+              </w:rPr>
+              <w:t>24 of 24 contract checks</w:t>
+            </w:r>
+          </w:p>
+        </w:tc>
+        <w:tc>
+          <w:tcPr>
+            <w:tcW w:type="dxa" w:w="5328"/>
+            <w:shd w:fill="FFFFFF"/>
+            <w:vAlign w:val="center"/>
+            <w:tcMar>
+              <w:top w:w="105" w:type="dxa"/>
+              <w:start w:w="115" w:type="dxa"/>
+              <w:bottom w:w="105" w:type="dxa"/>
+              <w:end w:w="115" w:type="dxa"/>
+            </w:tcMar>
+          </w:tcPr>
+          <w:p>
+            <w:pPr>
+              <w:spacing w:before="0" w:after="0" w:line="252" w:lineRule="auto"/>
+              <w:jc w:val="left"/>
+            </w:pPr>
+            <w:r>
+              <w:rPr>
+                <w:rFonts w:ascii="Aptos" w:hAnsi="Aptos"/>
+                <w:b w:val="0"/>
+                <w:i w:val="0"/>
+                <w:color w:val="000000"/>
+                <w:sz w:val="17"/>
+              </w:rPr>
+              <w:t>Intake 3, triage 4, knowledge 3, referral 4, transport support 3, follow-up 3 and chat 4; direct portal evaluator passes were limited to knowledge 3/3 and chat 4/4 because client-local tools were skipped</w:t>
+            </w:r>
+          </w:p>
+        </w:tc>
+      </w:tr>
+      <w:tr>
+        <w:trPr>
+          <w:cantSplit w:val="true"/>
+          <w:trHeight w:hRule="atLeast"/>
+        </w:trPr>
+        <w:tc>
+          <w:tcPr>
+            <w:tcW w:type="dxa" w:w="2088"/>
+            <w:shd w:fill="EAF1F4"/>
+            <w:vAlign w:val="center"/>
+            <w:tcMar>
+              <w:top w:w="105" w:type="dxa"/>
+              <w:start w:w="115" w:type="dxa"/>
+              <w:bottom w:w="105" w:type="dxa"/>
+              <w:end w:w="115" w:type="dxa"/>
+            </w:tcMar>
+          </w:tcPr>
+          <w:p>
+            <w:pPr>
+              <w:spacing w:before="0" w:after="0" w:line="252" w:lineRule="auto"/>
+              <w:jc w:val="left"/>
+            </w:pPr>
+            <w:r>
+              <w:rPr>
+                <w:rFonts w:ascii="Aptos" w:hAnsi="Aptos"/>
+                <w:b w:val="0"/>
+                <w:i w:val="0"/>
+                <w:color w:val="000000"/>
+                <w:sz w:val="17"/>
+              </w:rPr>
+              <w:t>Evaluation cost guard</w:t>
+            </w:r>
+          </w:p>
+        </w:tc>
+        <w:tc>
+          <w:tcPr>
+            <w:tcW w:type="dxa" w:w="2232"/>
+            <w:shd w:fill="EAF1F4"/>
+            <w:vAlign w:val="center"/>
+            <w:tcMar>
+              <w:top w:w="105" w:type="dxa"/>
+              <w:start w:w="115" w:type="dxa"/>
+              <w:bottom w:w="105" w:type="dxa"/>
+              <w:end w:w="115" w:type="dxa"/>
+            </w:tcMar>
+          </w:tcPr>
+          <w:p>
+            <w:pPr>
+              <w:spacing w:before="0" w:after="0" w:line="252" w:lineRule="auto"/>
+              <w:jc w:val="left"/>
+            </w:pPr>
+            <w:r>
+              <w:rPr>
+                <w:rFonts w:ascii="Aptos" w:hAnsi="Aptos"/>
+                <w:b w:val="0"/>
+                <w:i w:val="0"/>
+                <w:color w:val="000000"/>
+                <w:sz w:val="17"/>
+              </w:rPr>
+              <w:t>329,280-token modelled ceiling</w:t>
+            </w:r>
+          </w:p>
+        </w:tc>
+        <w:tc>
+          <w:tcPr>
+            <w:tcW w:type="dxa" w:w="5328"/>
+            <w:shd w:fill="EAF1F4"/>
+            <w:vAlign w:val="center"/>
+            <w:tcMar>
+              <w:top w:w="105" w:type="dxa"/>
+              <w:start w:w="115" w:type="dxa"/>
+              <w:bottom w:w="105" w:type="dxa"/>
+              <w:end w:w="115" w:type="dxa"/>
+            </w:tcMar>
+          </w:tcPr>
+          <w:p>
+            <w:pPr>
+              <w:spacing w:before="0" w:after="0" w:line="252" w:lineRule="auto"/>
+              <w:jc w:val="left"/>
+            </w:pPr>
+            <w:r>
+              <w:rPr>
+                <w:rFonts w:ascii="Aptos" w:hAnsi="Aptos"/>
+                <w:b w:val="0"/>
+                <w:i w:val="0"/>
+                <w:color w:val="000000"/>
+                <w:sz w:val="17"/>
+              </w:rPr>
+              <w:t>Below the configured 500,000-token cap; no optimiser was run</w:t>
+            </w:r>
+          </w:p>
+        </w:tc>
+      </w:tr>
+      <w:tr>
+        <w:trPr>
+          <w:cantSplit w:val="true"/>
+          <w:trHeight w:hRule="atLeast"/>
+        </w:trPr>
+        <w:tc>
+          <w:tcPr>
+            <w:tcW w:type="dxa" w:w="2088"/>
+            <w:shd w:fill="FFFFFF"/>
+            <w:vAlign w:val="center"/>
+            <w:tcMar>
+              <w:top w:w="105" w:type="dxa"/>
+              <w:start w:w="115" w:type="dxa"/>
+              <w:bottom w:w="105" w:type="dxa"/>
+              <w:end w:w="115" w:type="dxa"/>
+            </w:tcMar>
+          </w:tcPr>
+          <w:p>
+            <w:pPr>
+              <w:spacing w:before="0" w:after="0" w:line="252" w:lineRule="auto"/>
+              <w:jc w:val="left"/>
+            </w:pPr>
+            <w:r>
+              <w:rPr>
+                <w:rFonts w:ascii="Aptos" w:hAnsi="Aptos"/>
+                <w:b w:val="0"/>
+                <w:i w:val="0"/>
+                <w:color w:val="000000"/>
+                <w:sz w:val="17"/>
+              </w:rPr>
+              <w:t>Monitoring ingestion</w:t>
+            </w:r>
+          </w:p>
+        </w:tc>
+        <w:tc>
+          <w:tcPr>
+            <w:tcW w:type="dxa" w:w="2232"/>
+            <w:shd w:fill="FFFFFF"/>
+            <w:vAlign w:val="center"/>
+            <w:tcMar>
+              <w:top w:w="105" w:type="dxa"/>
+              <w:start w:w="115" w:type="dxa"/>
+              <w:bottom w:w="105" w:type="dxa"/>
+              <w:end w:w="115" w:type="dxa"/>
+            </w:tcMar>
+          </w:tcPr>
+          <w:p>
+            <w:pPr>
+              <w:spacing w:before="0" w:after="0" w:line="252" w:lineRule="auto"/>
+              <w:jc w:val="left"/>
+            </w:pPr>
+            <w:r>
+              <w:rPr>
+                <w:rFonts w:ascii="Aptos" w:hAnsi="Aptos"/>
+                <w:b w:val="0"/>
+                <w:i w:val="0"/>
+                <w:color w:val="000000"/>
+                <w:sz w:val="17"/>
+              </w:rPr>
+              <w:t>Verified for all seven agents</w:t>
+            </w:r>
+          </w:p>
+        </w:tc>
+        <w:tc>
+          <w:tcPr>
+            <w:tcW w:type="dxa" w:w="5328"/>
+            <w:shd w:fill="FFFFFF"/>
+            <w:vAlign w:val="center"/>
+            <w:tcMar>
+              <w:top w:w="105" w:type="dxa"/>
+              <w:start w:w="115" w:type="dxa"/>
+              <w:bottom w:w="105" w:type="dxa"/>
+              <w:end w:w="115" w:type="dxa"/>
+            </w:tcMar>
+          </w:tcPr>
+          <w:p>
+            <w:pPr>
+              <w:spacing w:before="0" w:after="0" w:line="252" w:lineRule="auto"/>
+              <w:jc w:val="left"/>
+            </w:pPr>
+            <w:r>
+              <w:rPr>
+                <w:rFonts w:ascii="Aptos" w:hAnsi="Aptos"/>
+                <w:b w:val="0"/>
+                <w:i w:val="0"/>
+                <w:color w:val="000000"/>
+                <w:sz w:val="17"/>
+              </w:rPr>
+              <w:t>Application Insights contained events, traces, dependencies and metrics with content capture disabled</w:t>
+            </w:r>
+          </w:p>
+        </w:tc>
+      </w:tr>
     </w:tbl>
     <w:p>
       <w:pPr>
         <w:widowControl/>
         <w:spacing w:after="40"/>
       </w:pPr>
+    </w:p>
+    <w:p>
+      <w:pPr>
+        <w:keepLines w:val="0"/>
+        <w:widowControl/>
+        <w:spacing w:after="120"/>
+      </w:pPr>
+      <w:r>
+        <w:rPr>
+          <w:rFonts w:ascii="Aptos" w:hAnsi="Aptos"/>
+          <w:b w:val="0"/>
+          <w:i w:val="0"/>
+          <w:color w:val="000000"/>
+          <w:sz w:val="21"/>
+        </w:rPr>
+        <w:t>Foundry directly invoked the hosted chat and File Search agents. Because Foundry cannot execute the five client-local Python tools, their direct target rows were skipped rather than passed by the portal evaluator. The application instead completed each restricted tool workflow, retained the Foundry response ID and evaluated the stored interaction for intent resolution, tool-call accuracy and tool-input accuracy. Therefore, 24/24 describes selected application contract completion, while the direct Foundry evaluator result is 3/3 for knowledge and 4/4 for chat; these are different measures.</w:t>
+      </w:r>
+    </w:p>
+    <w:p>
+      <w:pPr>
+        <w:keepLines w:val="0"/>
+        <w:widowControl/>
+        <w:spacing w:after="120"/>
+      </w:pPr>
+      <w:r>
+        <w:rPr>
+          <w:rFonts w:ascii="Aptos" w:hAnsi="Aptos"/>
+          <w:b w:val="0"/>
+          <w:i w:val="0"/>
+          <w:color w:val="000000"/>
+          <w:sz w:val="21"/>
+        </w:rPr>
+        <w:t>The local classification confusion matrix is: expected normal to actual unassessed 5; expected warning to warning 12; expected critical to critical 7; all other cells 0. The five abstentions are MAT-001, MAT-006, MAT-016, MAT-020 and MAT-021. They identify the missing clinically approved low-risk exclusion protocol and are not evidence of five normal classifications.</w:t>
+      </w:r>
+    </w:p>
+    <w:p>
+      <w:pPr>
+        <w:keepLines w:val="0"/>
+        <w:widowControl/>
+        <w:spacing w:after="120"/>
+      </w:pPr>
+      <w:r>
+        <w:rPr>
+          <w:rFonts w:ascii="Aptos" w:hAnsi="Aptos"/>
+          <w:b w:val="0"/>
+          <w:i w:val="0"/>
+          <w:color w:val="000000"/>
+          <w:sz w:val="21"/>
+        </w:rPr>
+        <w:t>Operational reliability is a separate release gate. The system currently records privacy-minimised operation counts and duration histograms, but this submission does not claim representative latency percentiles, realised cost per completed case, role-level agent/tool failure rates or recovery rates. Those measures, plus delayed and unavailable-network tests, must be collected by release version before production readiness can be assessed.</w:t>
+      </w:r>
     </w:p>
     <w:p>
       <w:pPr>
@@ -13982,9 +14440,34 @@
           <w:color w:val="000000"/>
           <w:sz w:val="18"/>
         </w:rPr>
-        <w:t xml:space="preserve">9. Nigeria Health Facility Registry. </w:t>
+        <w:t xml:space="preserve">9. Microsoft Learn  Evaluate agents. </w:t>
       </w:r>
       <w:hyperlink r:id="rId20">
+        <w:r>
+          <w:rPr>
+            <w:color w:val="183A4A"/>
+            <w:u w:val="single"/>
+          </w:rPr>
+          <w:t>https://learn.microsoft.com/en-us/azure/foundry/observability/how-to/evaluate-agent</w:t>
+        </w:r>
+      </w:hyperlink>
+    </w:p>
+    <w:p>
+      <w:pPr>
+        <w:widowControl/>
+        <w:spacing w:after="100"/>
+      </w:pPr>
+      <w:r>
+        <w:rPr>
+          <w:rFonts w:ascii="Aptos" w:hAnsi="Aptos"/>
+          <w:b w:val="0"/>
+          <w:i w:val="0"/>
+          <w:color w:val="000000"/>
+          <w:sz w:val="18"/>
+        </w:rPr>
+        <w:t xml:space="preserve">10. Nigeria Health Facility Registry. </w:t>
+      </w:r>
+      <w:hyperlink r:id="rId21">
         <w:r>
           <w:rPr>
             <w:color w:val="183A4A"/>
@@ -14007,9 +14490,9 @@
           <w:color w:val="000000"/>
           <w:sz w:val="18"/>
         </w:rPr>
-        <w:t xml:space="preserve">10. Apple Developer  Setting up HealthKit. </w:t>
+        <w:t xml:space="preserve">11. Apple Developer  Setting up HealthKit. </w:t>
       </w:r>
-      <w:hyperlink r:id="rId21">
+      <w:hyperlink r:id="rId22">
         <w:r>
           <w:rPr>
             <w:color w:val="183A4A"/>
@@ -14032,9 +14515,9 @@
           <w:color w:val="000000"/>
           <w:sz w:val="18"/>
         </w:rPr>
-        <w:t xml:space="preserve">11. Android Developers  Health Connect get started. </w:t>
+        <w:t xml:space="preserve">12. Android Developers  Health Connect get started. </w:t>
       </w:r>
-      <w:hyperlink r:id="rId22">
+      <w:hyperlink r:id="rId23">
         <w:r>
           <w:rPr>
             <w:color w:val="183A4A"/>
@@ -14104,6 +14587,24 @@
           <w:color w:val="000000"/>
           <w:sz w:val="18"/>
         </w:rPr>
+        <w:t>docs/foundry-evaluation-latest.json for Foundry evaluation IDs, run IDs, criteria, results and report links.</w:t>
+      </w:r>
+    </w:p>
+    <w:p>
+      <w:pPr>
+        <w:pStyle w:val="ListBullet"/>
+        <w:widowControl/>
+        <w:spacing w:after="60"/>
+        <w:ind w:left="360" w:hanging="230"/>
+      </w:pPr>
+      <w:r>
+        <w:rPr>
+          <w:rFonts w:ascii="Aptos" w:hAnsi="Aptos"/>
+          <w:b w:val="0"/>
+          <w:i w:val="0"/>
+          <w:color w:val="000000"/>
+          <w:sz w:val="18"/>
+        </w:rPr>
         <w:t>tests for API, personal data, workflow and Foundry agent boundary coverage.</w:t>
       </w:r>
     </w:p>
@@ -14152,7 +14653,7 @@
         <w:color w:val="4E5962"/>
         <w:sz w:val="17"/>
       </w:rPr>
-      <w:t xml:space="preserve">Final activity submission   |   24 September 2026   |   </w:t>
+      <w:t xml:space="preserve">Final activity submission   |   25 September 2026   |   </w:t>
     </w:r>
     <w:r>
       <w:rPr>

</xml_diff>